<commit_message>
Replace the former domain with rail.wvu.edu
</commit_message>
<xml_diff>
--- a/assets/lessons/telescope-research/public-use-report.docx
+++ b/assets/lessons/telescope-research/public-use-report.docx
@@ -1848,7 +1848,7 @@
         <w:t>DSPIRA Guided Tour</w:t>
       </w:r>
       <w:r>
-        <w:t>. Digital Signal Processing in Radio Astronomy Lesson Portal. https://wvurail.org/dspira/</w:t>
+        <w:t>. Digital Signal Processing in Radio Astronomy Lesson Portal. https://rail.wvu.edu/dspira/</w:t>
       </w:r>
     </w:p>
     <w:sectPr>
@@ -1912,7 +1912,7 @@
       </w:tabs>
     </w:pPr>
     <w:r>
-      <w:t>wvurail.org/dspira</w:t>
+      <w:t>rail.wvu.edu/dspira</w:t>
     </w:r>
     <w:r>
       <w:tab/>

</xml_diff>

<commit_message>
Move the website and published materials to rail.wvu.edu
</commit_message>
<xml_diff>
--- a/assets/lessons/telescope-research/public-use-report.docx
+++ b/assets/lessons/telescope-research/public-use-report.docx
@@ -1848,7 +1848,7 @@
         <w:t>DSPIRA Guided Tour</w:t>
       </w:r>
       <w:r>
-        <w:t>. Digital Signal Processing in Radio Astronomy Lesson Portal. https://wvurail.org/dspira/</w:t>
+        <w:t>. Digital Signal Processing in Radio Astronomy Lesson Portal. https://rail.wvu.edu/dspira/</w:t>
       </w:r>
     </w:p>
     <w:sectPr>
@@ -1912,7 +1912,7 @@
       </w:tabs>
     </w:pPr>
     <w:r>
-      <w:t>wvurail.org/dspira</w:t>
+      <w:t>rail.wvu.edu/dspira</w:t>
     </w:r>
     <w:r>
       <w:tab/>

</xml_diff>